<commit_message>
Remove fixed 30-40% DR bootstrap statements (ENV-005, DR-007, C-1)
- Research prompt §5.1: replace '~30-40% of Prod at bootstrap' with configurable
  lean bootstrap (DR-007/C-1), control-plane-first (DR-008), staged acquisition
  (DR-006/DR-019), max-not-sum destination sizing (DR-017/A.6)
- Executive deck builder: drop three '30-40% placeholder' strings
</commit_message>
<xml_diff>
--- a/Reference-Material/reference/acrme_research_and_design_prompt.docx
+++ b/Reference-Material/reference/acrme_research_and_design_prompt.docx
@@ -144,7 +144,6 @@
           <w:ilvl w:val="0"/>
           <w:numId w:val="1001"/>
         </w:numPr>
-        <w:pStyle w:val="Compact"/>
       </w:pPr>
       <w:r>
         <w:rPr>
@@ -166,7 +165,6 @@
           <w:ilvl w:val="0"/>
           <w:numId w:val="1001"/>
         </w:numPr>
-        <w:pStyle w:val="Compact"/>
       </w:pPr>
       <w:r>
         <w:rPr>
@@ -193,23 +191,38 @@
         </w:rPr>
         <w:t xml:space="preserve">Source of truth hierarchy:</w:t>
       </w:r>
-      <w:r>
-        <w:t xml:space="preserve"> </w:t>
-      </w:r>
-      <w:r>
-        <w:t xml:space="preserve">1. Microsoft Learn / Azure documentation (supersedes everything)</w:t>
-      </w:r>
-      <w:r>
-        <w:t xml:space="preserve"> </w:t>
-      </w:r>
-      <w:r>
-        <w:t xml:space="preserve">2. Azure Blogs, Product Group Guidance, Azure Updates, Microsoft GitHub Samples</w:t>
-      </w:r>
-      <w:r>
-        <w:t xml:space="preserve"> </w:t>
-      </w:r>
-      <w:r>
-        <w:t xml:space="preserve">3. Internal project documents (repo</w:t>
+    </w:p>
+    <w:p>
+      <w:pPr>
+        <w:numPr>
+          <w:ilvl w:val="0"/>
+          <w:numId w:val="1002"/>
+        </w:numPr>
+      </w:pPr>
+      <w:r>
+        <w:t xml:space="preserve">Microsoft Learn / Azure documentation (supersedes everything)</w:t>
+      </w:r>
+    </w:p>
+    <w:p>
+      <w:pPr>
+        <w:numPr>
+          <w:ilvl w:val="0"/>
+          <w:numId w:val="1002"/>
+        </w:numPr>
+      </w:pPr>
+      <w:r>
+        <w:t xml:space="preserve">Azure Blogs, Product Group Guidance, Azure Updates, Microsoft GitHub Samples</w:t>
+      </w:r>
+    </w:p>
+    <w:p>
+      <w:pPr>
+        <w:numPr>
+          <w:ilvl w:val="0"/>
+          <w:numId w:val="1002"/>
+        </w:numPr>
+      </w:pPr>
+      <w:r>
+        <w:t xml:space="preserve">Internal project documents (repo</w:t>
       </w:r>
       <w:r>
         <w:t xml:space="preserve"> </w:t>
@@ -247,16 +260,21 @@
       <w:r>
         <w:t xml:space="preserve">)</w:t>
       </w:r>
-      <w:r>
-        <w:t xml:space="preserve"> </w:t>
-      </w:r>
-      <w:r>
-        <w:t xml:space="preserve">4. Community sources (only when official guidance does not exist)</w:t>
-      </w:r>
-    </w:p>
-    <w:p>
-      <w:pPr>
-        <w:pStyle w:val="BodyText"/>
+    </w:p>
+    <w:p>
+      <w:pPr>
+        <w:numPr>
+          <w:ilvl w:val="0"/>
+          <w:numId w:val="1002"/>
+        </w:numPr>
+      </w:pPr>
+      <w:r>
+        <w:t xml:space="preserve">Community sources (only when official guidance does not exist)</w:t>
+      </w:r>
+    </w:p>
+    <w:p>
+      <w:pPr>
+        <w:pStyle w:val="FirstParagraph"/>
       </w:pPr>
       <w:r>
         <w:rPr>
@@ -265,15 +283,14 @@
         </w:rPr>
         <w:t xml:space="preserve">Confidence tagging — every claim you produce must carry one of these labels:</w:t>
       </w:r>
-      <w:r>
-        <w:t xml:space="preserve"> </w:t>
-      </w:r>
-      <w:r>
-        <w:t xml:space="preserve">-</w:t>
-      </w:r>
-      <w:r>
-        <w:t xml:space="preserve"> </w:t>
-      </w:r>
+    </w:p>
+    <w:p>
+      <w:pPr>
+        <w:numPr>
+          <w:ilvl w:val="0"/>
+          <w:numId w:val="1003"/>
+        </w:numPr>
+      </w:pPr>
       <w:r>
         <w:rPr>
           <w:rStyle w:val="VerbatimChar"/>
@@ -286,15 +303,14 @@
       <w:r>
         <w:t xml:space="preserve">— backed by Microsoft Learn or Azure platform documentation</w:t>
       </w:r>
-      <w:r>
-        <w:t xml:space="preserve"> </w:t>
-      </w:r>
-      <w:r>
-        <w:t xml:space="preserve">-</w:t>
-      </w:r>
-      <w:r>
-        <w:t xml:space="preserve"> </w:t>
-      </w:r>
+    </w:p>
+    <w:p>
+      <w:pPr>
+        <w:numPr>
+          <w:ilvl w:val="0"/>
+          <w:numId w:val="1003"/>
+        </w:numPr>
+      </w:pPr>
       <w:r>
         <w:rPr>
           <w:rStyle w:val="VerbatimChar"/>
@@ -307,15 +323,14 @@
       <w:r>
         <w:t xml:space="preserve">— an approved design decision recorded in the project ADR log</w:t>
       </w:r>
-      <w:r>
-        <w:t xml:space="preserve"> </w:t>
-      </w:r>
-      <w:r>
-        <w:t xml:space="preserve">-</w:t>
-      </w:r>
-      <w:r>
-        <w:t xml:space="preserve"> </w:t>
-      </w:r>
+    </w:p>
+    <w:p>
+      <w:pPr>
+        <w:numPr>
+          <w:ilvl w:val="0"/>
+          <w:numId w:val="1003"/>
+        </w:numPr>
+      </w:pPr>
       <w:r>
         <w:rPr>
           <w:rStyle w:val="VerbatimChar"/>
@@ -328,15 +343,14 @@
       <w:r>
         <w:t xml:space="preserve">— a logical consequence of the design; requires POC validation where noted</w:t>
       </w:r>
-      <w:r>
-        <w:t xml:space="preserve"> </w:t>
-      </w:r>
-      <w:r>
-        <w:t xml:space="preserve">-</w:t>
-      </w:r>
-      <w:r>
-        <w:t xml:space="preserve"> </w:t>
-      </w:r>
+    </w:p>
+    <w:p>
+      <w:pPr>
+        <w:numPr>
+          <w:ilvl w:val="0"/>
+          <w:numId w:val="1003"/>
+        </w:numPr>
+      </w:pPr>
       <w:r>
         <w:rPr>
           <w:rStyle w:val="VerbatimChar"/>
@@ -352,7 +366,7 @@
     </w:p>
     <w:p>
       <w:pPr>
-        <w:pStyle w:val="BodyText"/>
+        <w:pStyle w:val="FirstParagraph"/>
       </w:pPr>
       <w:r>
         <w:t xml:space="preserve">Never produce a recommendation without identifying its confidence level. Distinguish clearly between what is confirmed and what needs a proof-of-concept (POC).</w:t>
@@ -440,9 +454,8 @@
       <w:pPr>
         <w:numPr>
           <w:ilvl w:val="0"/>
-          <w:numId w:val="1002"/>
-        </w:numPr>
-        <w:pStyle w:val="Compact"/>
+          <w:numId w:val="1004"/>
+        </w:numPr>
       </w:pPr>
       <w:r>
         <w:rPr>
@@ -462,9 +475,8 @@
       <w:pPr>
         <w:numPr>
           <w:ilvl w:val="0"/>
-          <w:numId w:val="1002"/>
-        </w:numPr>
-        <w:pStyle w:val="Compact"/>
+          <w:numId w:val="1004"/>
+        </w:numPr>
       </w:pPr>
       <w:r>
         <w:rPr>
@@ -484,9 +496,8 @@
       <w:pPr>
         <w:numPr>
           <w:ilvl w:val="0"/>
-          <w:numId w:val="1002"/>
-        </w:numPr>
-        <w:pStyle w:val="Compact"/>
+          <w:numId w:val="1004"/>
+        </w:numPr>
       </w:pPr>
       <w:r>
         <w:rPr>
@@ -531,9 +542,8 @@
       <w:pPr>
         <w:numPr>
           <w:ilvl w:val="0"/>
-          <w:numId w:val="1003"/>
-        </w:numPr>
-        <w:pStyle w:val="Compact"/>
+          <w:numId w:val="1005"/>
+        </w:numPr>
       </w:pPr>
       <w:r>
         <w:t xml:space="preserve">It is</w:t>
@@ -556,9 +566,8 @@
       <w:pPr>
         <w:numPr>
           <w:ilvl w:val="0"/>
-          <w:numId w:val="1003"/>
-        </w:numPr>
-        <w:pStyle w:val="Compact"/>
+          <w:numId w:val="1005"/>
+        </w:numPr>
       </w:pPr>
       <w:r>
         <w:t xml:space="preserve">It is</w:t>
@@ -581,9 +590,8 @@
       <w:pPr>
         <w:numPr>
           <w:ilvl w:val="0"/>
-          <w:numId w:val="1003"/>
-        </w:numPr>
-        <w:pStyle w:val="Compact"/>
+          <w:numId w:val="1005"/>
+        </w:numPr>
       </w:pPr>
       <w:r>
         <w:t xml:space="preserve">It is</w:t>
@@ -665,9 +673,8 @@
       <w:pPr>
         <w:numPr>
           <w:ilvl w:val="0"/>
-          <w:numId w:val="1004"/>
-        </w:numPr>
-        <w:pStyle w:val="Compact"/>
+          <w:numId w:val="1006"/>
+        </w:numPr>
       </w:pPr>
       <w:r>
         <w:rPr>
@@ -686,9 +693,8 @@
       <w:pPr>
         <w:numPr>
           <w:ilvl w:val="0"/>
-          <w:numId w:val="1004"/>
-        </w:numPr>
-        <w:pStyle w:val="Compact"/>
+          <w:numId w:val="1006"/>
+        </w:numPr>
       </w:pPr>
       <w:r>
         <w:rPr>
@@ -707,9 +713,8 @@
       <w:pPr>
         <w:numPr>
           <w:ilvl w:val="0"/>
-          <w:numId w:val="1004"/>
-        </w:numPr>
-        <w:pStyle w:val="Compact"/>
+          <w:numId w:val="1006"/>
+        </w:numPr>
       </w:pPr>
       <w:r>
         <w:rPr>
@@ -744,9 +749,8 @@
       <w:pPr>
         <w:numPr>
           <w:ilvl w:val="0"/>
-          <w:numId w:val="1004"/>
-        </w:numPr>
-        <w:pStyle w:val="Compact"/>
+          <w:numId w:val="1006"/>
+        </w:numPr>
       </w:pPr>
       <w:r>
         <w:rPr>
@@ -765,9 +769,8 @@
       <w:pPr>
         <w:numPr>
           <w:ilvl w:val="0"/>
-          <w:numId w:val="1004"/>
-        </w:numPr>
-        <w:pStyle w:val="Compact"/>
+          <w:numId w:val="1006"/>
+        </w:numPr>
       </w:pPr>
       <w:r>
         <w:rPr>
@@ -802,9 +805,8 @@
       <w:pPr>
         <w:numPr>
           <w:ilvl w:val="0"/>
-          <w:numId w:val="1004"/>
-        </w:numPr>
-        <w:pStyle w:val="Compact"/>
+          <w:numId w:val="1006"/>
+        </w:numPr>
       </w:pPr>
       <w:r>
         <w:rPr>
@@ -887,9 +889,8 @@
       <w:pPr>
         <w:numPr>
           <w:ilvl w:val="0"/>
-          <w:numId w:val="1005"/>
-        </w:numPr>
-        <w:pStyle w:val="Compact"/>
+          <w:numId w:val="1007"/>
+        </w:numPr>
       </w:pPr>
       <w:r>
         <w:rPr>
@@ -958,9 +959,8 @@
       <w:pPr>
         <w:numPr>
           <w:ilvl w:val="0"/>
-          <w:numId w:val="1005"/>
-        </w:numPr>
-        <w:pStyle w:val="Compact"/>
+          <w:numId w:val="1007"/>
+        </w:numPr>
       </w:pPr>
       <w:r>
         <w:rPr>
@@ -979,9 +979,8 @@
       <w:pPr>
         <w:numPr>
           <w:ilvl w:val="0"/>
-          <w:numId w:val="1005"/>
-        </w:numPr>
-        <w:pStyle w:val="Compact"/>
+          <w:numId w:val="1007"/>
+        </w:numPr>
       </w:pPr>
       <w:r>
         <w:rPr>
@@ -1067,9 +1066,8 @@
       <w:pPr>
         <w:numPr>
           <w:ilvl w:val="0"/>
-          <w:numId w:val="1006"/>
-        </w:numPr>
-        <w:pStyle w:val="Compact"/>
+          <w:numId w:val="1008"/>
+        </w:numPr>
       </w:pPr>
       <w:r>
         <w:rPr>
@@ -1135,9 +1133,8 @@
       <w:pPr>
         <w:numPr>
           <w:ilvl w:val="0"/>
-          <w:numId w:val="1006"/>
-        </w:numPr>
-        <w:pStyle w:val="Compact"/>
+          <w:numId w:val="1008"/>
+        </w:numPr>
       </w:pPr>
       <w:r>
         <w:rPr>
@@ -1172,9 +1169,8 @@
       <w:pPr>
         <w:numPr>
           <w:ilvl w:val="0"/>
-          <w:numId w:val="1006"/>
-        </w:numPr>
-        <w:pStyle w:val="Compact"/>
+          <w:numId w:val="1008"/>
+        </w:numPr>
       </w:pPr>
       <w:r>
         <w:rPr>
@@ -1206,9 +1202,8 @@
       <w:pPr>
         <w:numPr>
           <w:ilvl w:val="0"/>
-          <w:numId w:val="1006"/>
-        </w:numPr>
-        <w:pStyle w:val="Compact"/>
+          <w:numId w:val="1008"/>
+        </w:numPr>
       </w:pPr>
       <w:r>
         <w:rPr>
@@ -1308,15 +1303,14 @@
         </w:rPr>
         <w:t xml:space="preserve">Two input paths:</w:t>
       </w:r>
-      <w:r>
-        <w:t xml:space="preserve"> </w:t>
-      </w:r>
-      <w:r>
-        <w:t xml:space="preserve">-</w:t>
-      </w:r>
-      <w:r>
-        <w:t xml:space="preserve"> </w:t>
-      </w:r>
+    </w:p>
+    <w:p>
+      <w:pPr>
+        <w:numPr>
+          <w:ilvl w:val="0"/>
+          <w:numId w:val="1009"/>
+        </w:numPr>
+      </w:pPr>
       <w:r>
         <w:rPr>
           <w:bCs/>
@@ -1345,15 +1339,14 @@
       <w:r>
         <w:t xml:space="preserve">as a post-validation readiness check.</w:t>
       </w:r>
-      <w:r>
-        <w:t xml:space="preserve"> </w:t>
-      </w:r>
-      <w:r>
-        <w:t xml:space="preserve">-</w:t>
-      </w:r>
-      <w:r>
-        <w:t xml:space="preserve"> </w:t>
-      </w:r>
+    </w:p>
+    <w:p>
+      <w:pPr>
+        <w:numPr>
+          <w:ilvl w:val="0"/>
+          <w:numId w:val="1009"/>
+        </w:numPr>
+      </w:pPr>
       <w:r>
         <w:rPr>
           <w:bCs/>
@@ -1385,6 +1378,73 @@
     </w:p>
     <w:p>
       <w:pPr>
+        <w:pStyle w:val="FirstParagraph"/>
+      </w:pPr>
+      <w:r>
+        <w:rPr>
+          <w:bCs/>
+          <w:b/>
+        </w:rPr>
+        <w:t xml:space="preserve">Placement Score formula (Prod):</w:t>
+      </w:r>
+    </w:p>
+    <w:p>
+      <w:pPr>
+        <w:pStyle w:val="SourceCode"/>
+      </w:pPr>
+      <w:r>
+        <w:rPr>
+          <w:rStyle w:val="VerbatimChar"/>
+        </w:rPr>
+        <w:t xml:space="preserve">PS_Prod(r) = α·Clamp(nonprod_crg.effective_free / prod_crg.quantity)</w:t>
+      </w:r>
+      <w:r>
+        <w:br/>
+      </w:r>
+      <w:r>
+        <w:rPr>
+          <w:rStyle w:val="VerbatimChar"/>
+        </w:rPr>
+        <w:t xml:space="preserve">           + β·Clamp(prod_crg.quota_headroom / prod_crg.quota_limit)</w:t>
+      </w:r>
+      <w:r>
+        <w:br/>
+      </w:r>
+      <w:r>
+        <w:rPr>
+          <w:rStyle w:val="VerbatimChar"/>
+        </w:rPr>
+        <w:t xml:space="preserve">           + γ·(1 − prod_customer_count / total_customers)          [total_customers: UNDEFINED in v2.4 — spec gap]</w:t>
+      </w:r>
+      <w:r>
+        <w:br/>
+      </w:r>
+      <w:r>
+        <w:rPr>
+          <w:rStyle w:val="VerbatimChar"/>
+        </w:rPr>
+        <w:t xml:space="preserve">           + δ·dr_crg.coverage_ratio</w:t>
+      </w:r>
+      <w:r>
+        <w:br/>
+      </w:r>
+      <w:r>
+        <w:rPr>
+          <w:rStyle w:val="VerbatimChar"/>
+        </w:rPr>
+        <w:t xml:space="preserve">           + ε·(az_count / 3)</w:t>
+      </w:r>
+    </w:p>
+    <w:p>
+      <w:pPr>
+        <w:pStyle w:val="FirstParagraph"/>
+      </w:pPr>
+      <w:r>
+        <w:t xml:space="preserve">Default weights: α=0.30, β=0.20, γ=0.25, δ=0.15, ε=0.10. All components clamped to [0,1]. Weights sum to 1.00.</w:t>
+      </w:r>
+    </w:p>
+    <w:p>
+      <w:pPr>
         <w:pStyle w:val="BodyText"/>
       </w:pPr>
       <w:r>
@@ -1392,77 +1452,10 @@
           <w:bCs/>
           <w:b/>
         </w:rPr>
-        <w:t xml:space="preserve">Placement Score formula (Prod):</w:t>
-      </w:r>
-    </w:p>
-    <w:p>
-      <w:pPr>
-        <w:pStyle w:val="SourceCode"/>
-      </w:pPr>
-      <w:r>
-        <w:rPr>
-          <w:rStyle w:val="VerbatimChar"/>
-        </w:rPr>
-        <w:t xml:space="preserve">PS_Prod(r) = α·Clamp(nonprod_crg.effective_free / prod_crg.quantity)</w:t>
+        <w:t xml:space="preserve">Critical design decision — why α uses NonProd headroom (not Prod headroom):</w:t>
       </w:r>
       <w:r>
         <w:br/>
-      </w:r>
-      <w:r>
-        <w:rPr>
-          <w:rStyle w:val="VerbatimChar"/>
-        </w:rPr>
-        <w:t xml:space="preserve">           + β·Clamp(prod_crg.quota_headroom / prod_crg.quota_limit)</w:t>
-      </w:r>
-      <w:r>
-        <w:br/>
-      </w:r>
-      <w:r>
-        <w:rPr>
-          <w:rStyle w:val="VerbatimChar"/>
-        </w:rPr>
-        <w:t xml:space="preserve">           + γ·(1 − prod_customer_count / total_customers)          [total_customers: UNDEFINED in v2.4 — spec gap]</w:t>
-      </w:r>
-      <w:r>
-        <w:br/>
-      </w:r>
-      <w:r>
-        <w:rPr>
-          <w:rStyle w:val="VerbatimChar"/>
-        </w:rPr>
-        <w:t xml:space="preserve">           + δ·dr_crg.coverage_ratio</w:t>
-      </w:r>
-      <w:r>
-        <w:br/>
-      </w:r>
-      <w:r>
-        <w:rPr>
-          <w:rStyle w:val="VerbatimChar"/>
-        </w:rPr>
-        <w:t xml:space="preserve">           + ε·(az_count / 3)</w:t>
-      </w:r>
-    </w:p>
-    <w:p>
-      <w:pPr>
-        <w:pStyle w:val="FirstParagraph"/>
-      </w:pPr>
-      <w:r>
-        <w:t xml:space="preserve">Default weights: α=0.30, β=0.20, γ=0.25, δ=0.15, ε=0.10. All components clamped to [0,1]. Weights sum to 1.00.</w:t>
-      </w:r>
-    </w:p>
-    <w:p>
-      <w:pPr>
-        <w:pStyle w:val="BodyText"/>
-      </w:pPr>
-      <w:r>
-        <w:rPr>
-          <w:bCs/>
-          <w:b/>
-        </w:rPr>
-        <w:t xml:space="preserve">Critical design decision — why α uses NonProd headroom (not Prod headroom):</w:t>
-      </w:r>
-      <w:r>
-        <w:t xml:space="preserve"> </w:t>
       </w:r>
       <w:r>
         <w:t xml:space="preserve">Using Prod headroom in α would be circular (measuring the thing you’re about to allocate against itself) and would create high correlation between α and β (combined 0.50 weight measuring the same Prod dimension). NonProd headroom is an independent signal of regional capacity health and provides forward-looking overflow/failover capacity. See</w:t>
@@ -1590,17 +1583,27 @@
       <w:r>
         <w:t xml:space="preserve">Quota is managed as a central, pooled resource governed across all subscriptions. The engine:</w:t>
       </w:r>
-      <w:r>
-        <w:t xml:space="preserve"> </w:t>
-      </w:r>
-      <w:r>
-        <w:t xml:space="preserve">- Maintains a single quota pool per region per VM family (QUA-004)</w:t>
-      </w:r>
-      <w:r>
-        <w:t xml:space="preserve"> </w:t>
-      </w:r>
-      <w:r>
-        <w:t xml:space="preserve">- Tracks</w:t>
+    </w:p>
+    <w:p>
+      <w:pPr>
+        <w:numPr>
+          <w:ilvl w:val="0"/>
+          <w:numId w:val="1010"/>
+        </w:numPr>
+      </w:pPr>
+      <w:r>
+        <w:t xml:space="preserve">Maintains a single quota pool per region per VM family (QUA-004)</w:t>
+      </w:r>
+    </w:p>
+    <w:p>
+      <w:pPr>
+        <w:numPr>
+          <w:ilvl w:val="0"/>
+          <w:numId w:val="1010"/>
+        </w:numPr>
+      </w:pPr>
+      <w:r>
+        <w:t xml:space="preserve">Tracks</w:t>
       </w:r>
       <w:r>
         <w:t xml:space="preserve"> </w:t>
@@ -1611,17 +1614,27 @@
         </w:rPr>
         <w:t xml:space="preserve">Available Quota = Assigned Regional VM-Family Quota − Current Regional VM-Family Usage</w:t>
       </w:r>
-      <w:r>
-        <w:t xml:space="preserve"> </w:t>
-      </w:r>
-      <w:r>
-        <w:t xml:space="preserve">- Manages a production quota buffer for growth (POC-008 defines initial buffer targets)</w:t>
-      </w:r>
-      <w:r>
-        <w:t xml:space="preserve"> </w:t>
-      </w:r>
-      <w:r>
-        <w:t xml:space="preserve">- Enforces DR floor accounting (</w:t>
+    </w:p>
+    <w:p>
+      <w:pPr>
+        <w:numPr>
+          <w:ilvl w:val="0"/>
+          <w:numId w:val="1010"/>
+        </w:numPr>
+      </w:pPr>
+      <w:r>
+        <w:t xml:space="preserve">Manages a production quota buffer for growth (POC-008 defines initial buffer targets)</w:t>
+      </w:r>
+    </w:p>
+    <w:p>
+      <w:pPr>
+        <w:numPr>
+          <w:ilvl w:val="0"/>
+          <w:numId w:val="1010"/>
+        </w:numPr>
+      </w:pPr>
+      <w:r>
+        <w:t xml:space="preserve">Enforces DR floor accounting (</w:t>
       </w:r>
       <w:r>
         <w:rPr>
@@ -1632,16 +1645,21 @@
       <w:r>
         <w:t xml:space="preserve">) to protect DR allocation</w:t>
       </w:r>
-      <w:r>
-        <w:t xml:space="preserve"> </w:t>
-      </w:r>
-      <w:r>
-        <w:t xml:space="preserve">- Triggers emergency quota transfers and tier escalations when thresholds are breached</w:t>
-      </w:r>
-    </w:p>
-    <w:p>
-      <w:pPr>
-        <w:pStyle w:val="BodyText"/>
+    </w:p>
+    <w:p>
+      <w:pPr>
+        <w:numPr>
+          <w:ilvl w:val="0"/>
+          <w:numId w:val="1010"/>
+        </w:numPr>
+      </w:pPr>
+      <w:r>
+        <w:t xml:space="preserve">Triggers emergency quota transfers and tier escalations when thresholds are breached</w:t>
+      </w:r>
+    </w:p>
+    <w:p>
+      <w:pPr>
+        <w:pStyle w:val="FirstParagraph"/>
       </w:pPr>
       <w:r>
         <w:t xml:space="preserve">Key formula:</w:t>
@@ -2079,17 +2097,27 @@
       <w:r>
         <w:t xml:space="preserve">(PLC-010a):</w:t>
       </w:r>
-      <w:r>
-        <w:t xml:space="preserve"> </w:t>
-      </w:r>
-      <w:r>
-        <w:t xml:space="preserve">- Prod → Region A (weighted selected)</w:t>
-      </w:r>
-      <w:r>
-        <w:t xml:space="preserve"> </w:t>
-      </w:r>
-      <w:r>
-        <w:t xml:space="preserve">- CVAL + DR → Region B (the other Standard region)</w:t>
+    </w:p>
+    <w:p>
+      <w:pPr>
+        <w:numPr>
+          <w:ilvl w:val="0"/>
+          <w:numId w:val="1011"/>
+        </w:numPr>
+      </w:pPr>
+      <w:r>
+        <w:t xml:space="preserve">Prod → Region A (weighted selected)</w:t>
+      </w:r>
+    </w:p>
+    <w:p>
+      <w:pPr>
+        <w:numPr>
+          <w:ilvl w:val="0"/>
+          <w:numId w:val="1011"/>
+        </w:numPr>
+      </w:pPr>
+      <w:r>
+        <w:t xml:space="preserve">CVAL + DR → Region B (the other Standard region)</w:t>
       </w:r>
     </w:p>
     <w:tbl>
@@ -2099,9 +2127,9 @@
         <w:tblLook w:firstRow="1" w:lastRow="0" w:firstColumn="0" w:lastColumn="0" w:noHBand="0" w:noVBand="0" w:val="0020"/>
       </w:tblPr>
       <w:tblGrid>
-        <w:gridCol w:w="2178"/>
-        <w:gridCol w:w="3366"/>
-        <w:gridCol w:w="2376"/>
+        <w:gridCol w:w="2640"/>
+        <w:gridCol w:w="2640"/>
+        <w:gridCol w:w="2640"/>
       </w:tblGrid>
       <w:tr>
         <w:trPr>
@@ -2273,9 +2301,8 @@
       <w:pPr>
         <w:numPr>
           <w:ilvl w:val="0"/>
-          <w:numId w:val="1007"/>
-        </w:numPr>
-        <w:pStyle w:val="Compact"/>
+          <w:numId w:val="1012"/>
+        </w:numPr>
       </w:pPr>
       <w:r>
         <w:t xml:space="preserve">Prod + CVAL → co-located in a</w:t>
@@ -2301,9 +2328,8 @@
       <w:pPr>
         <w:numPr>
           <w:ilvl w:val="0"/>
-          <w:numId w:val="1007"/>
-        </w:numPr>
-        <w:pStyle w:val="Compact"/>
+          <w:numId w:val="1012"/>
+        </w:numPr>
       </w:pPr>
       <w:r>
         <w:t xml:space="preserve">DR → placed in a</w:t>
@@ -2329,9 +2355,8 @@
       <w:pPr>
         <w:numPr>
           <w:ilvl w:val="0"/>
-          <w:numId w:val="1007"/>
-        </w:numPr>
-        <w:pStyle w:val="Compact"/>
+          <w:numId w:val="1012"/>
+        </w:numPr>
       </w:pPr>
       <w:r>
         <w:t xml:space="preserve">Per-country</w:t>
@@ -2356,9 +2381,8 @@
       <w:pPr>
         <w:numPr>
           <w:ilvl w:val="0"/>
-          <w:numId w:val="1007"/>
-        </w:numPr>
-        <w:pStyle w:val="Compact"/>
+          <w:numId w:val="1012"/>
+        </w:numPr>
       </w:pPr>
       <w:r>
         <w:t xml:space="preserve">Data-residency clearance required for applicable customer classes (assumption A-ME1)</w:t>
@@ -2504,7 +2528,183 @@
         <w:t xml:space="preserve"> </w:t>
       </w:r>
       <w:r>
-        <w:t xml:space="preserve">(POC-007 defines minimum per product) and scales on demand. Fixed large DR reserves have been rejected for cost reasons. DR allocation: approximately 30–40% of equivalent Prod capacity at bootstrap.</w:t>
+        <w:t xml:space="preserve">(POC-007 defines minimum per product) and scales on demand. Fixed large DR reserves have been rejected for cost reasons (Appendix D).</w:t>
+      </w:r>
+      <w:r>
+        <w:t xml:space="preserve"> </w:t>
+      </w:r>
+      <w:r>
+        <w:rPr>
+          <w:rStyle w:val="VerbatimChar"/>
+        </w:rPr>
+        <w:t xml:space="preserve">[Decided]</w:t>
+      </w:r>
+    </w:p>
+    <w:p>
+      <w:pPr>
+        <w:numPr>
+          <w:ilvl w:val="0"/>
+          <w:numId w:val="1013"/>
+        </w:numPr>
+        <w:pStyle w:val="Compact"/>
+      </w:pPr>
+      <w:r>
+        <w:rPr>
+          <w:bCs/>
+          <w:b/>
+        </w:rPr>
+        <w:t xml:space="preserve">No fixed percentage of Prod.</w:t>
+      </w:r>
+      <w:r>
+        <w:t xml:space="preserve"> </w:t>
+      </w:r>
+      <w:r>
+        <w:t xml:space="preserve">DR must not default to a fixed 30–40% copy of production (ENV-005). That model is</w:t>
+      </w:r>
+      <w:r>
+        <w:t xml:space="preserve"> </w:t>
+      </w:r>
+      <w:r>
+        <w:rPr>
+          <w:bCs/>
+          <w:b/>
+        </w:rPr>
+        <w:t xml:space="preserve">retired</w:t>
+      </w:r>
+      <w:r>
+        <w:t xml:space="preserve"> </w:t>
+      </w:r>
+      <w:r>
+        <w:t xml:space="preserve">(Calc Logic Reference Scenario 15 → 17; POC workbook A-09).</w:t>
+      </w:r>
+      <w:r>
+        <w:t xml:space="preserve"> </w:t>
+      </w:r>
+      <w:r>
+        <w:rPr>
+          <w:rStyle w:val="VerbatimChar"/>
+        </w:rPr>
+        <w:t xml:space="preserve">[Decided]</w:t>
+      </w:r>
+    </w:p>
+    <w:p>
+      <w:pPr>
+        <w:numPr>
+          <w:ilvl w:val="0"/>
+          <w:numId w:val="1013"/>
+        </w:numPr>
+        <w:pStyle w:val="Compact"/>
+      </w:pPr>
+      <w:r>
+        <w:rPr>
+          <w:bCs/>
+          <w:b/>
+        </w:rPr>
+        <w:t xml:space="preserve">Bootstrap is a configurable target</w:t>
+      </w:r>
+      <w:r>
+        <w:t xml:space="preserve">, not a ratio: a node count, SKU-specific quantity, vCPU value, workload tier, or approved percentage, set by product and region (DR-007; C-1</w:t>
+      </w:r>
+      <w:r>
+        <w:t xml:space="preserve"> </w:t>
+      </w:r>
+      <w:r>
+        <w:t xml:space="preserve">“</w:t>
+      </w:r>
+      <w:r>
+        <w:t xml:space="preserve">Configurable — no fixed value</w:t>
+      </w:r>
+      <w:r>
+        <w:t xml:space="preserve">”</w:t>
+      </w:r>
+      <w:r>
+        <w:t xml:space="preserve">). It holds only the minimum needed to bring up control planes and recovery orchestration first (DR-008) —</w:t>
+      </w:r>
+      <w:r>
+        <w:t xml:space="preserve"> </w:t>
+      </w:r>
+      <w:r>
+        <w:t xml:space="preserve">“</w:t>
+      </w:r>
+      <w:r>
+        <w:t xml:space="preserve">whatever is needed to bootstrap and is used = effectively free</w:t>
+      </w:r>
+      <w:r>
+        <w:t xml:space="preserve">”</w:t>
+      </w:r>
+      <w:r>
+        <w:t xml:space="preserve">.</w:t>
+      </w:r>
+      <w:r>
+        <w:t xml:space="preserve"> </w:t>
+      </w:r>
+      <w:r>
+        <w:rPr>
+          <w:rStyle w:val="VerbatimChar"/>
+        </w:rPr>
+        <w:t xml:space="preserve">[Decided]</w:t>
+      </w:r>
+    </w:p>
+    <w:p>
+      <w:pPr>
+        <w:numPr>
+          <w:ilvl w:val="0"/>
+          <w:numId w:val="1013"/>
+        </w:numPr>
+        <w:pStyle w:val="Compact"/>
+      </w:pPr>
+      <w:r>
+        <w:rPr>
+          <w:bCs/>
+          <w:b/>
+        </w:rPr>
+        <w:t xml:space="preserve">Beyond bootstrap, capacity is acquired in stages</w:t>
+      </w:r>
+      <w:r>
+        <w:t xml:space="preserve"> </w:t>
+      </w:r>
+      <w:r>
+        <w:t xml:space="preserve">on activation: bootstrap headroom → existing reservation/quota in the destination → CVAL sacrifice → sharing/reassignment → pooled quota → Azure request (DR-006, DR-019).</w:t>
+      </w:r>
+      <w:r>
+        <w:t xml:space="preserve"> </w:t>
+      </w:r>
+      <w:r>
+        <w:rPr>
+          <w:rStyle w:val="VerbatimChar"/>
+        </w:rPr>
+        <w:t xml:space="preserve">[Decided]</w:t>
+      </w:r>
+    </w:p>
+    <w:p>
+      <w:pPr>
+        <w:numPr>
+          <w:ilvl w:val="0"/>
+          <w:numId w:val="1013"/>
+        </w:numPr>
+        <w:pStyle w:val="Compact"/>
+      </w:pPr>
+      <w:r>
+        <w:rPr>
+          <w:bCs/>
+          <w:b/>
+        </w:rPr>
+        <w:t xml:space="preserve">Destination sizing is max-not-sum</w:t>
+      </w:r>
+      <w:r>
+        <w:t xml:space="preserve"> </w:t>
+      </w:r>
+      <w:r>
+        <w:t xml:space="preserve">(DR-017, A.6, §5.2 below); a SUM override exists only where a contract requires concurrent-failure protection (C-11).</w:t>
+      </w:r>
+      <w:r>
+        <w:t xml:space="preserve"> </w:t>
+      </w:r>
+      <w:r>
+        <w:rPr>
+          <w:rStyle w:val="VerbatimChar"/>
+        </w:rPr>
+        <w:t xml:space="preserve">[Decided]</w:t>
       </w:r>
     </w:p>
     <w:bookmarkEnd w:id="37"/>
@@ -2703,8 +2903,8 @@
         <w:tblLook w:firstRow="1" w:lastRow="0" w:firstColumn="0" w:lastColumn="0" w:noHBand="0" w:noVBand="0" w:val="0020"/>
       </w:tblPr>
       <w:tblGrid>
-        <w:gridCol w:w="1218"/>
-        <w:gridCol w:w="6701"/>
+        <w:gridCol w:w="3960"/>
+        <w:gridCol w:w="3960"/>
       </w:tblGrid>
       <w:tr>
         <w:trPr>
@@ -2996,8 +3196,8 @@
         <w:tblLook w:firstRow="1" w:lastRow="0" w:firstColumn="0" w:lastColumn="0" w:noHBand="0" w:noVBand="0" w:val="0020"/>
       </w:tblPr>
       <w:tblGrid>
-        <w:gridCol w:w="3046"/>
-        <w:gridCol w:w="4873"/>
+        <w:gridCol w:w="3960"/>
+        <w:gridCol w:w="3960"/>
       </w:tblGrid>
       <w:tr>
         <w:trPr>
@@ -3458,9 +3658,8 @@
       <w:pPr>
         <w:numPr>
           <w:ilvl w:val="0"/>
-          <w:numId w:val="1008"/>
-        </w:numPr>
-        <w:pStyle w:val="Compact"/>
+          <w:numId w:val="1014"/>
+        </w:numPr>
       </w:pPr>
       <w:r>
         <w:t xml:space="preserve">Evaluates PS_Prod, PS_NonProd, PS_DR across 8 candidate regions using blended capacity/quota numbers</w:t>
@@ -3470,9 +3669,8 @@
       <w:pPr>
         <w:numPr>
           <w:ilvl w:val="0"/>
-          <w:numId w:val="1008"/>
-        </w:numPr>
-        <w:pStyle w:val="Compact"/>
+          <w:numId w:val="1014"/>
+        </w:numPr>
       </w:pPr>
       <w:r>
         <w:t xml:space="preserve">Produces Prod/CVAL/DR recommendations and a ranked candidate table</w:t>
@@ -3482,9 +3680,8 @@
       <w:pPr>
         <w:numPr>
           <w:ilvl w:val="0"/>
-          <w:numId w:val="1008"/>
-        </w:numPr>
-        <w:pStyle w:val="Compact"/>
+          <w:numId w:val="1014"/>
+        </w:numPr>
       </w:pPr>
       <w:r>
         <w:t xml:space="preserve">Builder:</w:t>
@@ -3522,9 +3719,8 @@
       <w:pPr>
         <w:numPr>
           <w:ilvl w:val="0"/>
-          <w:numId w:val="1009"/>
-        </w:numPr>
-        <w:pStyle w:val="Compact"/>
+          <w:numId w:val="1015"/>
+        </w:numPr>
       </w:pPr>
       <w:r>
         <w:t xml:space="preserve">Evaluates placement at</w:t>
@@ -3559,9 +3755,8 @@
       <w:pPr>
         <w:numPr>
           <w:ilvl w:val="0"/>
-          <w:numId w:val="1009"/>
-        </w:numPr>
-        <w:pStyle w:val="Compact"/>
+          <w:numId w:val="1015"/>
+        </w:numPr>
       </w:pPr>
       <w:r>
         <w:t xml:space="preserve">Supports</w:t>
@@ -3587,9 +3782,8 @@
       <w:pPr>
         <w:numPr>
           <w:ilvl w:val="0"/>
-          <w:numId w:val="1009"/>
-        </w:numPr>
-        <w:pStyle w:val="Compact"/>
+          <w:numId w:val="1015"/>
+        </w:numPr>
       </w:pPr>
       <w:r>
         <w:rPr>
@@ -3618,9 +3812,8 @@
       <w:pPr>
         <w:numPr>
           <w:ilvl w:val="0"/>
-          <w:numId w:val="1009"/>
-        </w:numPr>
-        <w:pStyle w:val="Compact"/>
+          <w:numId w:val="1015"/>
+        </w:numPr>
       </w:pPr>
       <w:r>
         <w:t xml:space="preserve">α/β/ε each aggregated as</w:t>
@@ -3646,9 +3839,8 @@
       <w:pPr>
         <w:numPr>
           <w:ilvl w:val="0"/>
-          <w:numId w:val="1009"/>
-        </w:numPr>
-        <w:pStyle w:val="Compact"/>
+          <w:numId w:val="1015"/>
+        </w:numPr>
       </w:pPr>
       <w:r>
         <w:rPr>
@@ -3671,9 +3863,8 @@
       <w:pPr>
         <w:numPr>
           <w:ilvl w:val="0"/>
-          <w:numId w:val="1009"/>
-        </w:numPr>
-        <w:pStyle w:val="Compact"/>
+          <w:numId w:val="1015"/>
+        </w:numPr>
       </w:pPr>
       <w:r>
         <w:rPr>
@@ -3713,9 +3904,8 @@
       <w:pPr>
         <w:numPr>
           <w:ilvl w:val="0"/>
-          <w:numId w:val="1009"/>
-        </w:numPr>
-        <w:pStyle w:val="Compact"/>
+          <w:numId w:val="1015"/>
+        </w:numPr>
       </w:pPr>
       <w:r>
         <w:t xml:space="preserve">Builder:</w:t>
@@ -3790,8 +3980,8 @@
         <w:tblLook w:firstRow="1" w:lastRow="0" w:firstColumn="0" w:lastColumn="0" w:noHBand="0" w:noVBand="0" w:val="0020"/>
       </w:tblPr>
       <w:tblGrid>
-        <w:gridCol w:w="2795"/>
-        <w:gridCol w:w="5124"/>
+        <w:gridCol w:w="3960"/>
+        <w:gridCol w:w="3960"/>
       </w:tblGrid>
       <w:tr>
         <w:trPr>
@@ -4132,9 +4322,8 @@
       <w:pPr>
         <w:numPr>
           <w:ilvl w:val="0"/>
-          <w:numId w:val="1010"/>
-        </w:numPr>
-        <w:pStyle w:val="Compact"/>
+          <w:numId w:val="1016"/>
+        </w:numPr>
       </w:pPr>
       <w:r>
         <w:rPr>
@@ -4154,9 +4343,8 @@
       <w:pPr>
         <w:numPr>
           <w:ilvl w:val="0"/>
-          <w:numId w:val="1010"/>
-        </w:numPr>
-        <w:pStyle w:val="Compact"/>
+          <w:numId w:val="1016"/>
+        </w:numPr>
       </w:pPr>
       <w:r>
         <w:rPr>
@@ -4176,9 +4364,8 @@
       <w:pPr>
         <w:numPr>
           <w:ilvl w:val="0"/>
-          <w:numId w:val="1010"/>
-        </w:numPr>
-        <w:pStyle w:val="Compact"/>
+          <w:numId w:val="1016"/>
+        </w:numPr>
       </w:pPr>
       <w:r>
         <w:rPr>
@@ -4198,9 +4385,8 @@
       <w:pPr>
         <w:numPr>
           <w:ilvl w:val="0"/>
-          <w:numId w:val="1010"/>
-        </w:numPr>
-        <w:pStyle w:val="Compact"/>
+          <w:numId w:val="1016"/>
+        </w:numPr>
       </w:pPr>
       <w:r>
         <w:rPr>
@@ -4220,9 +4406,8 @@
       <w:pPr>
         <w:numPr>
           <w:ilvl w:val="0"/>
-          <w:numId w:val="1010"/>
-        </w:numPr>
-        <w:pStyle w:val="Compact"/>
+          <w:numId w:val="1016"/>
+        </w:numPr>
       </w:pPr>
       <w:r>
         <w:rPr>
@@ -4242,9 +4427,8 @@
       <w:pPr>
         <w:numPr>
           <w:ilvl w:val="0"/>
-          <w:numId w:val="1010"/>
-        </w:numPr>
-        <w:pStyle w:val="Compact"/>
+          <w:numId w:val="1016"/>
+        </w:numPr>
       </w:pPr>
       <w:r>
         <w:rPr>
@@ -4264,9 +4448,8 @@
       <w:pPr>
         <w:numPr>
           <w:ilvl w:val="0"/>
-          <w:numId w:val="1010"/>
-        </w:numPr>
-        <w:pStyle w:val="Compact"/>
+          <w:numId w:val="1016"/>
+        </w:numPr>
       </w:pPr>
       <w:r>
         <w:rPr>
@@ -4286,9 +4469,8 @@
       <w:pPr>
         <w:numPr>
           <w:ilvl w:val="0"/>
-          <w:numId w:val="1010"/>
-        </w:numPr>
-        <w:pStyle w:val="Compact"/>
+          <w:numId w:val="1016"/>
+        </w:numPr>
       </w:pPr>
       <w:r>
         <w:rPr>
@@ -4842,9 +5024,8 @@
       <w:pPr>
         <w:numPr>
           <w:ilvl w:val="0"/>
-          <w:numId w:val="1011"/>
-        </w:numPr>
-        <w:pStyle w:val="Compact"/>
+          <w:numId w:val="1017"/>
+        </w:numPr>
       </w:pPr>
       <w:r>
         <w:t xml:space="preserve">Identity and RBAC requirements</w:t>
@@ -4854,9 +5035,8 @@
       <w:pPr>
         <w:numPr>
           <w:ilvl w:val="0"/>
-          <w:numId w:val="1011"/>
-        </w:numPr>
-        <w:pStyle w:val="Compact"/>
+          <w:numId w:val="1017"/>
+        </w:numPr>
       </w:pPr>
       <w:r>
         <w:t xml:space="preserve">Managed Identity usage</w:t>
@@ -4866,9 +5046,8 @@
       <w:pPr>
         <w:numPr>
           <w:ilvl w:val="0"/>
-          <w:numId w:val="1011"/>
-        </w:numPr>
-        <w:pStyle w:val="Compact"/>
+          <w:numId w:val="1017"/>
+        </w:numPr>
       </w:pPr>
       <w:r>
         <w:t xml:space="preserve">Key Vault / secret management</w:t>
@@ -4878,9 +5057,8 @@
       <w:pPr>
         <w:numPr>
           <w:ilvl w:val="0"/>
-          <w:numId w:val="1011"/>
-        </w:numPr>
-        <w:pStyle w:val="Compact"/>
+          <w:numId w:val="1017"/>
+        </w:numPr>
       </w:pPr>
       <w:r>
         <w:t xml:space="preserve">Network isolation requirements</w:t>
@@ -4890,9 +5068,8 @@
       <w:pPr>
         <w:numPr>
           <w:ilvl w:val="0"/>
-          <w:numId w:val="1011"/>
-        </w:numPr>
-        <w:pStyle w:val="Compact"/>
+          <w:numId w:val="1017"/>
+        </w:numPr>
       </w:pPr>
       <w:r>
         <w:t xml:space="preserve">Policy and governance controls</w:t>
@@ -4912,9 +5089,8 @@
       <w:pPr>
         <w:numPr>
           <w:ilvl w:val="0"/>
-          <w:numId w:val="1012"/>
-        </w:numPr>
-        <w:pStyle w:val="Compact"/>
+          <w:numId w:val="1018"/>
+        </w:numPr>
       </w:pPr>
       <w:r>
         <w:t xml:space="preserve">Availability Zone coverage</w:t>
@@ -4924,9 +5100,8 @@
       <w:pPr>
         <w:numPr>
           <w:ilvl w:val="0"/>
-          <w:numId w:val="1012"/>
-        </w:numPr>
-        <w:pStyle w:val="Compact"/>
+          <w:numId w:val="1018"/>
+        </w:numPr>
       </w:pPr>
       <w:r>
         <w:t xml:space="preserve">Failure mode analysis (what happens when this component fails?)</w:t>
@@ -4936,9 +5111,8 @@
       <w:pPr>
         <w:numPr>
           <w:ilvl w:val="0"/>
-          <w:numId w:val="1012"/>
-        </w:numPr>
-        <w:pStyle w:val="Compact"/>
+          <w:numId w:val="1018"/>
+        </w:numPr>
       </w:pPr>
       <w:r>
         <w:t xml:space="preserve">RTO / RPO implications</w:t>
@@ -4948,9 +5122,8 @@
       <w:pPr>
         <w:numPr>
           <w:ilvl w:val="0"/>
-          <w:numId w:val="1012"/>
-        </w:numPr>
-        <w:pStyle w:val="Compact"/>
+          <w:numId w:val="1018"/>
+        </w:numPr>
       </w:pPr>
       <w:r>
         <w:t xml:space="preserve">Reconciliation and self-healing behaviour</w:t>
@@ -4970,9 +5143,8 @@
       <w:pPr>
         <w:numPr>
           <w:ilvl w:val="0"/>
-          <w:numId w:val="1013"/>
-        </w:numPr>
-        <w:pStyle w:val="Compact"/>
+          <w:numId w:val="1019"/>
+        </w:numPr>
       </w:pPr>
       <w:r>
         <w:t xml:space="preserve">Throughput and latency targets</w:t>
@@ -4982,9 +5154,8 @@
       <w:pPr>
         <w:numPr>
           <w:ilvl w:val="0"/>
-          <w:numId w:val="1013"/>
-        </w:numPr>
-        <w:pStyle w:val="Compact"/>
+          <w:numId w:val="1019"/>
+        </w:numPr>
       </w:pPr>
       <w:r>
         <w:t xml:space="preserve">API rate limits (Azure control plane throttling is a known risk — POC-004)</w:t>
@@ -4994,9 +5165,8 @@
       <w:pPr>
         <w:numPr>
           <w:ilvl w:val="0"/>
-          <w:numId w:val="1013"/>
-        </w:numPr>
-        <w:pStyle w:val="Compact"/>
+          <w:numId w:val="1019"/>
+        </w:numPr>
       </w:pPr>
       <w:r>
         <w:t xml:space="preserve">Scaling model</w:t>
@@ -5016,9 +5186,8 @@
       <w:pPr>
         <w:numPr>
           <w:ilvl w:val="0"/>
-          <w:numId w:val="1014"/>
-        </w:numPr>
-        <w:pStyle w:val="Compact"/>
+          <w:numId w:val="1020"/>
+        </w:numPr>
       </w:pPr>
       <w:r>
         <w:t xml:space="preserve">Reservation idle cost implications</w:t>
@@ -5028,9 +5197,8 @@
       <w:pPr>
         <w:numPr>
           <w:ilvl w:val="0"/>
-          <w:numId w:val="1014"/>
-        </w:numPr>
-        <w:pStyle w:val="Compact"/>
+          <w:numId w:val="1020"/>
+        </w:numPr>
       </w:pPr>
       <w:r>
         <w:t xml:space="preserve">Quota allocation cost implications</w:t>
@@ -5040,9 +5208,8 @@
       <w:pPr>
         <w:numPr>
           <w:ilvl w:val="0"/>
-          <w:numId w:val="1014"/>
-        </w:numPr>
-        <w:pStyle w:val="Compact"/>
+          <w:numId w:val="1020"/>
+        </w:numPr>
       </w:pPr>
       <w:r>
         <w:t xml:space="preserve">FinOps tagging and tracking requirements</w:t>
@@ -5062,9 +5229,8 @@
       <w:pPr>
         <w:numPr>
           <w:ilvl w:val="0"/>
-          <w:numId w:val="1015"/>
-        </w:numPr>
-        <w:pStyle w:val="Compact"/>
+          <w:numId w:val="1021"/>
+        </w:numPr>
       </w:pPr>
       <w:r>
         <w:t xml:space="preserve">Automation opportunities</w:t>
@@ -5074,9 +5240,8 @@
       <w:pPr>
         <w:numPr>
           <w:ilvl w:val="0"/>
-          <w:numId w:val="1015"/>
-        </w:numPr>
-        <w:pStyle w:val="Compact"/>
+          <w:numId w:val="1021"/>
+        </w:numPr>
       </w:pPr>
       <w:r>
         <w:t xml:space="preserve">Monitoring and observability requirements</w:t>
@@ -5086,9 +5251,8 @@
       <w:pPr>
         <w:numPr>
           <w:ilvl w:val="0"/>
-          <w:numId w:val="1015"/>
-        </w:numPr>
-        <w:pStyle w:val="Compact"/>
+          <w:numId w:val="1021"/>
+        </w:numPr>
       </w:pPr>
       <w:r>
         <w:t xml:space="preserve">Deployment model (IaC, CI/CD)</w:t>
@@ -5098,9 +5262,8 @@
       <w:pPr>
         <w:numPr>
           <w:ilvl w:val="0"/>
-          <w:numId w:val="1015"/>
-        </w:numPr>
-        <w:pStyle w:val="Compact"/>
+          <w:numId w:val="1021"/>
+        </w:numPr>
       </w:pPr>
       <w:r>
         <w:t xml:space="preserve">Dry-run capability requirements</w:t>
@@ -5128,9 +5291,8 @@
       <w:pPr>
         <w:numPr>
           <w:ilvl w:val="0"/>
-          <w:numId w:val="1016"/>
-        </w:numPr>
-        <w:pStyle w:val="Compact"/>
+          <w:numId w:val="1022"/>
+        </w:numPr>
       </w:pPr>
       <w:r>
         <w:rPr>
@@ -5165,9 +5327,8 @@
       <w:pPr>
         <w:numPr>
           <w:ilvl w:val="0"/>
-          <w:numId w:val="1016"/>
-        </w:numPr>
-        <w:pStyle w:val="Compact"/>
+          <w:numId w:val="1022"/>
+        </w:numPr>
       </w:pPr>
       <w:r>
         <w:rPr>
@@ -5187,9 +5348,8 @@
       <w:pPr>
         <w:numPr>
           <w:ilvl w:val="0"/>
-          <w:numId w:val="1016"/>
-        </w:numPr>
-        <w:pStyle w:val="Compact"/>
+          <w:numId w:val="1022"/>
+        </w:numPr>
       </w:pPr>
       <w:r>
         <w:rPr>
@@ -5209,9 +5369,8 @@
       <w:pPr>
         <w:numPr>
           <w:ilvl w:val="0"/>
-          <w:numId w:val="1016"/>
-        </w:numPr>
-        <w:pStyle w:val="Compact"/>
+          <w:numId w:val="1022"/>
+        </w:numPr>
       </w:pPr>
       <w:r>
         <w:rPr>
@@ -5231,9 +5390,8 @@
       <w:pPr>
         <w:numPr>
           <w:ilvl w:val="0"/>
-          <w:numId w:val="1016"/>
-        </w:numPr>
-        <w:pStyle w:val="Compact"/>
+          <w:numId w:val="1022"/>
+        </w:numPr>
       </w:pPr>
       <w:r>
         <w:rPr>
@@ -5253,9 +5411,8 @@
       <w:pPr>
         <w:numPr>
           <w:ilvl w:val="0"/>
-          <w:numId w:val="1016"/>
-        </w:numPr>
-        <w:pStyle w:val="Compact"/>
+          <w:numId w:val="1022"/>
+        </w:numPr>
       </w:pPr>
       <w:r>
         <w:rPr>
@@ -5275,9 +5432,8 @@
       <w:pPr>
         <w:numPr>
           <w:ilvl w:val="0"/>
-          <w:numId w:val="1016"/>
-        </w:numPr>
-        <w:pStyle w:val="Compact"/>
+          <w:numId w:val="1022"/>
+        </w:numPr>
       </w:pPr>
       <w:r>
         <w:rPr>
@@ -5326,9 +5482,8 @@
       <w:pPr>
         <w:numPr>
           <w:ilvl w:val="0"/>
-          <w:numId w:val="1016"/>
-        </w:numPr>
-        <w:pStyle w:val="Compact"/>
+          <w:numId w:val="1022"/>
+        </w:numPr>
       </w:pPr>
       <w:r>
         <w:rPr>
@@ -5348,9 +5503,8 @@
       <w:pPr>
         <w:numPr>
           <w:ilvl w:val="0"/>
-          <w:numId w:val="1016"/>
-        </w:numPr>
-        <w:pStyle w:val="Compact"/>
+          <w:numId w:val="1022"/>
+        </w:numPr>
       </w:pPr>
       <w:r>
         <w:rPr>
@@ -5370,9 +5524,8 @@
       <w:pPr>
         <w:numPr>
           <w:ilvl w:val="0"/>
-          <w:numId w:val="1016"/>
-        </w:numPr>
-        <w:pStyle w:val="Compact"/>
+          <w:numId w:val="1022"/>
+        </w:numPr>
       </w:pPr>
       <w:r>
         <w:rPr>
@@ -5743,24 +5896,6 @@
     <w:abstractNumId w:val="991"/>
   </w:num>
   <w:num w:numId="1004">
-    <w:abstractNumId w:val="991"/>
-  </w:num>
-  <w:num w:numId="1005">
-    <w:abstractNumId w:val="991"/>
-  </w:num>
-  <w:num w:numId="1006">
-    <w:abstractNumId w:val="991"/>
-  </w:num>
-  <w:num w:numId="1007">
-    <w:abstractNumId w:val="991"/>
-  </w:num>
-  <w:num w:numId="1008">
-    <w:abstractNumId w:val="991"/>
-  </w:num>
-  <w:num w:numId="1009">
-    <w:abstractNumId w:val="991"/>
-  </w:num>
-  <w:num w:numId="1010">
     <w:abstractNumId w:val="99411"/>
     <w:lvlOverride w:ilvl="0">
       <w:startOverride w:val="1"/>
@@ -5790,6 +5925,24 @@
       <w:startOverride w:val="1"/>
     </w:lvlOverride>
   </w:num>
+  <w:num w:numId="1005">
+    <w:abstractNumId w:val="991"/>
+  </w:num>
+  <w:num w:numId="1006">
+    <w:abstractNumId w:val="991"/>
+  </w:num>
+  <w:num w:numId="1007">
+    <w:abstractNumId w:val="991"/>
+  </w:num>
+  <w:num w:numId="1008">
+    <w:abstractNumId w:val="991"/>
+  </w:num>
+  <w:num w:numId="1009">
+    <w:abstractNumId w:val="991"/>
+  </w:num>
+  <w:num w:numId="1010">
+    <w:abstractNumId w:val="991"/>
+  </w:num>
   <w:num w:numId="1011">
     <w:abstractNumId w:val="991"/>
   </w:num>
@@ -5806,6 +5959,51 @@
     <w:abstractNumId w:val="991"/>
   </w:num>
   <w:num w:numId="1016">
+    <w:abstractNumId w:val="99411"/>
+    <w:lvlOverride w:ilvl="0">
+      <w:startOverride w:val="1"/>
+    </w:lvlOverride>
+    <w:lvlOverride w:ilvl="1">
+      <w:startOverride w:val="1"/>
+    </w:lvlOverride>
+    <w:lvlOverride w:ilvl="2">
+      <w:startOverride w:val="1"/>
+    </w:lvlOverride>
+    <w:lvlOverride w:ilvl="3">
+      <w:startOverride w:val="1"/>
+    </w:lvlOverride>
+    <w:lvlOverride w:ilvl="4">
+      <w:startOverride w:val="1"/>
+    </w:lvlOverride>
+    <w:lvlOverride w:ilvl="5">
+      <w:startOverride w:val="1"/>
+    </w:lvlOverride>
+    <w:lvlOverride w:ilvl="6">
+      <w:startOverride w:val="1"/>
+    </w:lvlOverride>
+    <w:lvlOverride w:ilvl="7">
+      <w:startOverride w:val="1"/>
+    </w:lvlOverride>
+    <w:lvlOverride w:ilvl="8">
+      <w:startOverride w:val="1"/>
+    </w:lvlOverride>
+  </w:num>
+  <w:num w:numId="1017">
+    <w:abstractNumId w:val="991"/>
+  </w:num>
+  <w:num w:numId="1018">
+    <w:abstractNumId w:val="991"/>
+  </w:num>
+  <w:num w:numId="1019">
+    <w:abstractNumId w:val="991"/>
+  </w:num>
+  <w:num w:numId="1020">
+    <w:abstractNumId w:val="991"/>
+  </w:num>
+  <w:num w:numId="1021">
+    <w:abstractNumId w:val="991"/>
+  </w:num>
+  <w:num w:numId="1022">
     <w:abstractNumId w:val="99411"/>
     <w:lvlOverride w:ilvl="0">
       <w:startOverride w:val="1"/>

</xml_diff>